<commit_message>
clean environment and add genuine to headers
</commit_message>
<xml_diff>
--- a/results/main/Table_4.docx
+++ b/results/main/Table_4.docx
@@ -39,40 +39,40 @@
               <w:jc w:val="center"/>
             </w:pPr>
             <w:r>
-              <w:t>0% heterogeneity: Model 1 Estimate (SE)</w:t>
-            </w:r>
-          </w:p>
-        </w:tc>
-        <w:tc>
-          <w:p>
-            <w:pPr>
-              <w:pStyle w:val="Normal"/>
-              <w:jc w:val="center"/>
-            </w:pPr>
-            <w:r>
-              <w:t>0% heterogeneity: Model 2 Estimate (SE)</w:t>
-            </w:r>
-          </w:p>
-        </w:tc>
-        <w:tc>
-          <w:p>
-            <w:pPr>
-              <w:pStyle w:val="Normal"/>
-              <w:jc w:val="center"/>
-            </w:pPr>
-            <w:r>
-              <w:t>50% heterogeneity: Model 1 Estimate (SE)</w:t>
-            </w:r>
-          </w:p>
-        </w:tc>
-        <w:tc>
-          <w:p>
-            <w:pPr>
-              <w:pStyle w:val="Normal"/>
-              <w:jc w:val="center"/>
-            </w:pPr>
-            <w:r>
-              <w:t>50% heterogeneity: Model 2 Estimate (SE)</w:t>
+              <w:t>0% genuine heterogeneity: Model 1 Estimate (SE)</w:t>
+            </w:r>
+          </w:p>
+        </w:tc>
+        <w:tc>
+          <w:p>
+            <w:pPr>
+              <w:pStyle w:val="Normal"/>
+              <w:jc w:val="center"/>
+            </w:pPr>
+            <w:r>
+              <w:t>0% genuine heterogeneity: Model 2 Estimate (SE)</w:t>
+            </w:r>
+          </w:p>
+        </w:tc>
+        <w:tc>
+          <w:p>
+            <w:pPr>
+              <w:pStyle w:val="Normal"/>
+              <w:jc w:val="center"/>
+            </w:pPr>
+            <w:r>
+              <w:t>50% genuine heterogeneity: Model 1 Estimate (SE)</w:t>
+            </w:r>
+          </w:p>
+        </w:tc>
+        <w:tc>
+          <w:p>
+            <w:pPr>
+              <w:pStyle w:val="Normal"/>
+              <w:jc w:val="center"/>
+            </w:pPr>
+            <w:r>
+              <w:t>50% genuine heterogeneity: Model 2 Estimate (SE)</w:t>
             </w:r>
           </w:p>
         </w:tc>

</xml_diff>